<commit_message>
Add ShiloH display name
</commit_message>
<xml_diff>
--- a/assets/CV_Xinlong_Le_EN.docx
+++ b/assets/CV_Xinlong_Le_EN.docx
@@ -14,7 +14,7 @@
           <w:color w:val="000000"/>
           <w:sz w:val="44"/>
         </w:rPr>
-        <w:t>Xinlong Le</w:t>
+        <w:t>Xinlong Le (ShiloH)</w:t>
       </w:r>
     </w:p>
     <w:p>
@@ -1074,7 +1074,7 @@
         <w:color w:val="5A5A5A"/>
         <w:sz w:val="17"/>
       </w:rPr>
-      <w:t>Xinlong Le | Curriculum Vitae | Updated June 2026</w:t>
+      <w:t>Xinlong Le (ShiloH) | Curriculum Vitae | Updated June 2026</w:t>
     </w:r>
   </w:p>
 </w:ftr>

</xml_diff>